<commit_message>
added extra articulatory passages from jackie
</commit_message>
<xml_diff>
--- a/stimuli/articulatory_complexity_passage.docx
+++ b/stimuli/articulatory_complexity_passage.docx
@@ -4,21 +4,333 @@
   <w:body>
     <w:p>
       <w:pPr>
-        <w:rPr>
-          <w:rFonts w:ascii="Arial" w:hAnsi="Arial" w:cs="Arial"/>
-          <w:sz w:val="40"/>
-          <w:szCs w:val="40"/>
-        </w:rPr>
-      </w:pPr>
-      <w:r>
-        <w:rPr>
-          <w:rFonts w:ascii="Arial" w:hAnsi="Arial" w:cs="Arial"/>
+        <w:spacing w:before="100" w:beforeAutospacing="1" w:after="100" w:afterAutospacing="1"/>
+        <w:jc w:val="center"/>
+        <w:outlineLvl w:val="1"/>
+        <w:rPr>
+          <w:rFonts w:ascii="Times New Roman" w:eastAsia="Times New Roman" w:hAnsi="Times New Roman" w:cs="Times New Roman"/>
+          <w:b/>
+          <w:bCs/>
+          <w:sz w:val="40"/>
+          <w:szCs w:val="40"/>
+        </w:rPr>
+      </w:pPr>
+      <w:r>
+        <w:rPr>
+          <w:rFonts w:ascii="Times New Roman" w:eastAsia="Times New Roman" w:hAnsi="Times New Roman" w:cs="Times New Roman"/>
+          <w:b/>
+          <w:bCs/>
+          <w:sz w:val="40"/>
+          <w:szCs w:val="40"/>
+        </w:rPr>
+        <w:t xml:space="preserve">Passage </w:t>
+      </w:r>
+      <w:r>
+        <w:rPr>
+          <w:rFonts w:ascii="Times New Roman" w:eastAsia="Times New Roman" w:hAnsi="Times New Roman" w:cs="Times New Roman"/>
+          <w:b/>
+          <w:bCs/>
+          <w:sz w:val="40"/>
+          <w:szCs w:val="40"/>
+        </w:rPr>
+        <w:t>1</w:t>
+      </w:r>
+    </w:p>
+    <w:p>
+      <w:pPr>
+        <w:spacing w:line="276" w:lineRule="auto"/>
+        <w:rPr>
+          <w:rFonts w:ascii="Times New Roman" w:hAnsi="Times New Roman" w:cs="Times New Roman"/>
           <w:color w:val="000000"/>
           <w:sz w:val="40"/>
           <w:szCs w:val="40"/>
         </w:rPr>
-        <w:t>The young judge had kept a long thought to himself for the better part of a month. He walked north, back from the dark valley, watching the soft haze shift with great care, yet with great faith in what he felt. Each year he thought of shape and value: five great changes, if you looked with sharp eyes. Yes, but perhaps you never both reach and hold the sharp edge of it, he yet had no clear view. He gave the last hour to a new map, this shape spread flat before him. He felt each line, ran fast across the page, then moved the whole thing toward the light. Back home, the long years had not made it clearer. Yet the form held, much the same, much good still in it. Dark shape or not, he chose to speak, his voice low, watching each face. Five more had gathered; of both sides, map before them, none moved. By the time he finished, each thought was his own.</w:t>
-      </w:r>
+      </w:pPr>
+      <w:r>
+        <w:rPr>
+          <w:rFonts w:ascii="Times New Roman" w:hAnsi="Times New Roman" w:cs="Times New Roman"/>
+          <w:sz w:val="40"/>
+          <w:szCs w:val="40"/>
+        </w:rPr>
+        <w:t xml:space="preserve">The young judge had kept a long thought to himself for the better part of a month. He walked north, back from the dark valley, watching the soft haze shift with great care, yet with great faith in what he felt. Each year he thought of shape and value: five great changes, if you looked with sharp </w:t>
+      </w:r>
+      <w:r>
+        <w:rPr>
+          <w:rFonts w:ascii="Times New Roman" w:hAnsi="Times New Roman" w:cs="Times New Roman"/>
+          <w:color w:val="000000"/>
+          <w:sz w:val="40"/>
+          <w:szCs w:val="40"/>
+        </w:rPr>
+        <w:t>eyes. Yes, but perhaps you never both reach and hold the sharp edge of it, he yet had no clear view. He gave the last hour to a new map, this shape spread flat before him. He felt each line, ran fast across the page, then moved the whole thing toward the light. Back home, the long years had not made it clearer. Yet the form held, much the same, much good still in it. Dark shape or not, he chose to speak, his voice low, watching each face. Five more had gathered; of both sides, map before them, none moved. By the time he finished, each thought was his own.</w:t>
+      </w:r>
+    </w:p>
+    <w:p>
+      <w:pPr>
+        <w:rPr>
+          <w:rFonts w:ascii="Times New Roman" w:hAnsi="Times New Roman" w:cs="Times New Roman"/>
+          <w:color w:val="000000"/>
+          <w:sz w:val="40"/>
+          <w:szCs w:val="40"/>
+        </w:rPr>
+      </w:pPr>
+      <w:r>
+        <w:rPr>
+          <w:rFonts w:ascii="Times New Roman" w:hAnsi="Times New Roman" w:cs="Times New Roman"/>
+          <w:color w:val="000000"/>
+          <w:sz w:val="40"/>
+          <w:szCs w:val="40"/>
+        </w:rPr>
+        <w:br w:type="page"/>
+      </w:r>
+    </w:p>
+    <w:p>
+      <w:pPr>
+        <w:spacing w:before="100" w:beforeAutospacing="1" w:after="100" w:afterAutospacing="1"/>
+        <w:jc w:val="center"/>
+        <w:outlineLvl w:val="1"/>
+        <w:rPr>
+          <w:rFonts w:ascii="Times New Roman" w:eastAsia="Times New Roman" w:hAnsi="Times New Roman" w:cs="Times New Roman"/>
+          <w:b/>
+          <w:bCs/>
+          <w:sz w:val="40"/>
+          <w:szCs w:val="40"/>
+        </w:rPr>
+      </w:pPr>
+      <w:r>
+        <w:rPr>
+          <w:rFonts w:ascii="Times New Roman" w:eastAsia="Times New Roman" w:hAnsi="Times New Roman" w:cs="Times New Roman"/>
+          <w:b/>
+          <w:bCs/>
+          <w:sz w:val="40"/>
+          <w:szCs w:val="40"/>
+        </w:rPr>
+        <w:lastRenderedPageBreak/>
+        <w:t xml:space="preserve">Passage </w:t>
+      </w:r>
+      <w:r>
+        <w:rPr>
+          <w:rFonts w:ascii="Times New Roman" w:eastAsia="Times New Roman" w:hAnsi="Times New Roman" w:cs="Times New Roman"/>
+          <w:b/>
+          <w:bCs/>
+          <w:sz w:val="40"/>
+          <w:szCs w:val="40"/>
+        </w:rPr>
+        <w:t>2</w:t>
+      </w:r>
+    </w:p>
+    <w:p>
+      <w:pPr>
+        <w:spacing w:before="100" w:beforeAutospacing="1" w:after="100" w:afterAutospacing="1"/>
+        <w:jc w:val="both"/>
+        <w:rPr>
+          <w:rFonts w:ascii="Times New Roman" w:eastAsia="Times New Roman" w:hAnsi="Times New Roman" w:cs="Times New Roman"/>
+          <w:sz w:val="40"/>
+          <w:szCs w:val="40"/>
+        </w:rPr>
+      </w:pPr>
+      <w:r>
+        <w:rPr>
+          <w:rFonts w:ascii="Times New Roman" w:eastAsia="Times New Roman" w:hAnsi="Times New Roman" w:cs="Times New Roman"/>
+          <w:sz w:val="40"/>
+          <w:szCs w:val="40"/>
+        </w:rPr>
+        <w:t>Beyond the broken beacon, the pilot drifted past a dim gateway, tracing coded signals from distant planets. The robot scanned terrain below, mapping plasma bursts and magnetic storms that bent the horizon toward silence.</w:t>
+      </w:r>
+    </w:p>
+    <w:p>
+      <w:pPr>
+        <w:spacing w:before="100" w:beforeAutospacing="1" w:after="100" w:afterAutospacing="1"/>
+        <w:jc w:val="both"/>
+        <w:rPr>
+          <w:rFonts w:ascii="Times New Roman" w:eastAsia="Times New Roman" w:hAnsi="Times New Roman" w:cs="Times New Roman"/>
+          <w:sz w:val="40"/>
+          <w:szCs w:val="40"/>
+        </w:rPr>
+      </w:pPr>
+      <w:r>
+        <w:rPr>
+          <w:rFonts w:ascii="Times New Roman" w:eastAsia="Times New Roman" w:hAnsi="Times New Roman" w:cs="Times New Roman"/>
+          <w:sz w:val="40"/>
+          <w:szCs w:val="40"/>
+        </w:rPr>
+        <w:t>A quantum probe transmitted data back, but glitches crept between packets, shifting temporal bounds and warping neural models. The captain paused briefly, then spoke calmly, directing agents to track anomalies across sectors.</w:t>
+      </w:r>
+    </w:p>
+    <w:p>
+      <w:pPr>
+        <w:spacing w:before="100" w:beforeAutospacing="1" w:after="100" w:afterAutospacing="1"/>
+        <w:jc w:val="both"/>
+        <w:rPr>
+          <w:rFonts w:ascii="Times New Roman" w:eastAsia="Times New Roman" w:hAnsi="Times New Roman" w:cs="Times New Roman"/>
+          <w:sz w:val="40"/>
+          <w:szCs w:val="40"/>
+        </w:rPr>
+      </w:pPr>
+      <w:r>
+        <w:rPr>
+          <w:rFonts w:ascii="Times New Roman" w:eastAsia="Times New Roman" w:hAnsi="Times New Roman" w:cs="Times New Roman"/>
+          <w:sz w:val="40"/>
+          <w:szCs w:val="40"/>
+        </w:rPr>
+        <w:t>Through the void, fragments collided softly, forming strange composite structures as biomechanical systems adapted rapidly. The device logged transitions precisely, capturing patterns bridging bilabial bursts to velar closures to alveolar taps, as if the universe itself encoded motion through shifting articulations.</w:t>
+      </w:r>
+    </w:p>
+    <w:p>
+      <w:pPr>
+        <w:spacing w:before="100" w:beforeAutospacing="1" w:after="100" w:afterAutospacing="1"/>
+        <w:jc w:val="both"/>
+        <w:rPr>
+          <w:rFonts w:ascii="Times New Roman" w:eastAsia="Times New Roman" w:hAnsi="Times New Roman" w:cs="Times New Roman"/>
+          <w:sz w:val="40"/>
+          <w:szCs w:val="40"/>
+        </w:rPr>
+      </w:pPr>
+      <w:r>
+        <w:rPr>
+          <w:rFonts w:ascii="Times New Roman" w:eastAsia="Times New Roman" w:hAnsi="Times New Roman" w:cs="Times New Roman"/>
+          <w:sz w:val="40"/>
+          <w:szCs w:val="40"/>
+        </w:rPr>
+        <w:t>At the edge of a fractured nebula, the crew pushed forward bravely, chasing a signal that pulsed sharply, then faded slowly, leaving a coded imprint between memory and matter.</w:t>
+      </w:r>
+    </w:p>
+    <w:p>
+      <w:pPr>
+        <w:rPr>
+          <w:rFonts w:ascii="Times New Roman" w:hAnsi="Times New Roman" w:cs="Times New Roman"/>
+          <w:sz w:val="40"/>
+          <w:szCs w:val="40"/>
+        </w:rPr>
+      </w:pPr>
+      <w:r>
+        <w:rPr>
+          <w:rFonts w:ascii="Times New Roman" w:hAnsi="Times New Roman" w:cs="Times New Roman"/>
+          <w:sz w:val="40"/>
+          <w:szCs w:val="40"/>
+        </w:rPr>
+        <w:br w:type="page"/>
+      </w:r>
+    </w:p>
+    <w:p>
+      <w:pPr>
+        <w:spacing w:before="100" w:beforeAutospacing="1" w:after="100" w:afterAutospacing="1"/>
+        <w:jc w:val="center"/>
+        <w:outlineLvl w:val="1"/>
+        <w:rPr>
+          <w:rFonts w:ascii="Times New Roman" w:eastAsia="Times New Roman" w:hAnsi="Times New Roman" w:cs="Times New Roman"/>
+          <w:b/>
+          <w:bCs/>
+          <w:sz w:val="40"/>
+          <w:szCs w:val="40"/>
+        </w:rPr>
+      </w:pPr>
+      <w:r>
+        <w:rPr>
+          <w:rFonts w:ascii="Times New Roman" w:eastAsia="Times New Roman" w:hAnsi="Times New Roman" w:cs="Times New Roman"/>
+          <w:b/>
+          <w:bCs/>
+          <w:sz w:val="40"/>
+          <w:szCs w:val="40"/>
+        </w:rPr>
+        <w:lastRenderedPageBreak/>
+        <w:t xml:space="preserve">Passage </w:t>
+      </w:r>
+      <w:r>
+        <w:rPr>
+          <w:rFonts w:ascii="Times New Roman" w:eastAsia="Times New Roman" w:hAnsi="Times New Roman" w:cs="Times New Roman"/>
+          <w:b/>
+          <w:bCs/>
+          <w:sz w:val="40"/>
+          <w:szCs w:val="40"/>
+        </w:rPr>
+        <w:t>3</w:t>
+      </w:r>
+    </w:p>
+    <w:p>
+      <w:pPr>
+        <w:spacing w:before="100" w:beforeAutospacing="1" w:after="100" w:afterAutospacing="1"/>
+        <w:jc w:val="both"/>
+        <w:rPr>
+          <w:rFonts w:ascii="Times New Roman" w:eastAsia="Times New Roman" w:hAnsi="Times New Roman" w:cs="Times New Roman"/>
+          <w:sz w:val="40"/>
+          <w:szCs w:val="40"/>
+        </w:rPr>
+      </w:pPr>
+      <w:r>
+        <w:rPr>
+          <w:rFonts w:ascii="Times New Roman" w:eastAsia="Times New Roman" w:hAnsi="Times New Roman" w:cs="Times New Roman"/>
+          <w:sz w:val="40"/>
+          <w:szCs w:val="40"/>
+        </w:rPr>
+        <w:t>Within a sealed module chamber, the swift engineer calibrated circuits, then triggered backup thrusters during launch. A fading relay shimmered weakly, sending distorted bursts across remote systems as gravitational fields twisted abruptly, then relaxed gradually.</w:t>
+      </w:r>
+    </w:p>
+    <w:p>
+      <w:pPr>
+        <w:spacing w:before="100" w:beforeAutospacing="1" w:after="100" w:afterAutospacing="1"/>
+        <w:jc w:val="both"/>
+        <w:rPr>
+          <w:rFonts w:ascii="Times New Roman" w:eastAsia="Times New Roman" w:hAnsi="Times New Roman" w:cs="Times New Roman"/>
+          <w:sz w:val="40"/>
+          <w:szCs w:val="40"/>
+        </w:rPr>
+      </w:pPr>
+      <w:r>
+        <w:rPr>
+          <w:rFonts w:ascii="Times New Roman" w:eastAsia="Times New Roman" w:hAnsi="Times New Roman" w:cs="Times New Roman"/>
+          <w:sz w:val="40"/>
+          <w:szCs w:val="40"/>
+        </w:rPr>
+        <w:t>The fusion core vibrated steadily, but erratic pulses disrupted timing, forcing precise vector corrections under pressure. A synthetic assistant filtered streams continuously, aligning dynamic schemas with incoming data while charged particles drifted beyond the vessel.</w:t>
+      </w:r>
+    </w:p>
+    <w:p>
+      <w:pPr>
+        <w:spacing w:before="100" w:beforeAutospacing="1" w:after="100" w:afterAutospacing="1"/>
+        <w:jc w:val="both"/>
+        <w:rPr>
+          <w:rFonts w:ascii="Times New Roman" w:eastAsia="Times New Roman" w:hAnsi="Times New Roman" w:cs="Times New Roman"/>
+          <w:sz w:val="40"/>
+          <w:szCs w:val="40"/>
+        </w:rPr>
+      </w:pPr>
+      <w:r>
+        <w:rPr>
+          <w:rFonts w:ascii="Times New Roman" w:eastAsia="Times New Roman" w:hAnsi="Times New Roman" w:cs="Times New Roman"/>
+          <w:sz w:val="40"/>
+          <w:szCs w:val="40"/>
+        </w:rPr>
+        <w:t>Across deep space, scattered clusters shifted slowly, forming complex geometric patterns that flickered intermittently. The commander inhaled sharply, then spoke quietly, directing teams to scan peripheral zones and flag irregular signatures.</w:t>
+      </w:r>
+    </w:p>
+    <w:p>
+      <w:pPr>
+        <w:spacing w:before="100" w:beforeAutospacing="1" w:after="100" w:afterAutospacing="1"/>
+        <w:jc w:val="both"/>
+        <w:rPr>
+          <w:rFonts w:ascii="Times New Roman" w:eastAsia="Times New Roman" w:hAnsi="Times New Roman" w:cs="Times New Roman"/>
+          <w:sz w:val="40"/>
+          <w:szCs w:val="40"/>
+        </w:rPr>
+      </w:pPr>
+      <w:r>
+        <w:rPr>
+          <w:rFonts w:ascii="Times New Roman" w:eastAsia="Times New Roman" w:hAnsi="Times New Roman" w:cs="Times New Roman"/>
+          <w:sz w:val="40"/>
+          <w:szCs w:val="40"/>
+        </w:rPr>
+        <w:t>Near a collapsing corridor, the crew advanced cautiously, tracing a fragmented transmission that spiked suddenly, then stabilized unevenly, leaving a residual trace between structure and signal.</w:t>
+      </w:r>
+    </w:p>
+    <w:p>
+      <w:pPr>
+        <w:spacing w:line="276" w:lineRule="auto"/>
+        <w:rPr>
+          <w:rFonts w:ascii="Times New Roman" w:hAnsi="Times New Roman" w:cs="Times New Roman"/>
+          <w:sz w:val="40"/>
+          <w:szCs w:val="40"/>
+        </w:rPr>
+      </w:pPr>
     </w:p>
     <w:sectPr>
       <w:pgSz w:w="12240" w:h="15840"/>

</xml_diff>